<commit_message>
Word (BOI): fill all 16 sections including the commercial ones
The projects carry real Payment Method / Software Agreement / Signatures
content, so keeping the template boilerplate for those dropped it from the
export. Remove them from KEEP_TEMPLATE (now empty) and re-tag the template so
all 16 sections get a {@body<KEY>} slot; add the three keys to the route's
SECTION_KEYS. Regenerated public/boi/SRS_Template.tagged.docx.

Co-Authored-By: Claude Opus 4.8 <noreply@anthropic.com>
</commit_message>
<xml_diff>
--- a/public/boi/SRS_Template.tagged.docx
+++ b/public/boi/SRS_Template.tagged.docx
@@ -1288,424 +1288,9 @@
       </w:r>
     </w:p>
     <w:p>
-      <w:pPr>
-        <w:rPr>
-          <w:lang w:eastAsia="ja-JP"/>
-        </w:rPr>
-      </w:pPr>
-    </w:p>
-    <w:tbl>
-      <w:tblPr>
-        <w:tblW w:w="9209" w:type="dxa"/>
-        <w:tblBorders>
-          <w:top w:val="single" w:sz="4" w:space="0" w:color="auto"/>
-          <w:left w:val="single" w:sz="4" w:space="0" w:color="auto"/>
-          <w:bottom w:val="single" w:sz="4" w:space="0" w:color="auto"/>
-          <w:right w:val="single" w:sz="4" w:space="0" w:color="auto"/>
-          <w:insideH w:val="single" w:sz="4" w:space="0" w:color="auto"/>
-          <w:insideV w:val="single" w:sz="4" w:space="0" w:color="auto"/>
-        </w:tblBorders>
-        <w:tblCellMar>
-          <w:left w:w="10" w:type="dxa"/>
-          <w:right w:w="10" w:type="dxa"/>
-        </w:tblCellMar>
-        <w:tblLook w:val="04A0" w:firstRow="1" w:lastRow="0" w:firstColumn="1" w:lastColumn="0" w:noHBand="0" w:noVBand="1"/>
-      </w:tblPr>
-      <w:tblGrid>
-        <w:gridCol w:w="1838"/>
-        <w:gridCol w:w="2835"/>
-        <w:gridCol w:w="4536"/>
-      </w:tblGrid>
-      <w:tr>
-        <w:trPr>
-          <w:tblHeader/>
-        </w:trPr>
-        <w:tc>
-          <w:tcPr>
-            <w:tcW w:w="1838" w:type="dxa"/>
-            <w:tcBorders>
-              <w:top w:val="single" w:sz="4" w:space="0" w:color="AAAAAA"/>
-              <w:left w:val="single" w:sz="4" w:space="0" w:color="AAAAAA"/>
-              <w:bottom w:val="single" w:sz="4" w:space="0" w:color="AAAAAA"/>
-              <w:right w:val="single" w:sz="4" w:space="0" w:color="AAAAAA"/>
-            </w:tcBorders>
-            <w:shd w:val="clear" w:color="auto" w:fill="1F3864"/>
-            <w:tcMar>
-              <w:top w:w="80" w:type="dxa"/>
-              <w:left w:w="120" w:type="dxa"/>
-              <w:bottom w:w="80" w:type="dxa"/>
-              <w:right w:w="120" w:type="dxa"/>
-            </w:tcMar>
-            <w:vAlign w:val="center"/>
-          </w:tcPr>
-          <w:p>
-            <w:pPr>
-              <w:jc w:val="center"/>
-              <w:rPr>
-                <w:sz w:val="28"/>
-                <w:szCs w:val="28"/>
-              </w:rPr>
-            </w:pPr>
-            <w:r>
-              <w:rPr>
-                <w:rFonts w:hint="cs"/>
-                <w:b/>
-                <w:bCs/>
-                <w:color w:val="FFFFFF"/>
-                <w:sz w:val="28"/>
-                <w:szCs w:val="28"/>
-                <w:cs/>
-              </w:rPr>
-              <w:t>ประเภท</w:t>
-            </w:r>
-          </w:p>
-        </w:tc>
-        <w:tc>
-          <w:tcPr>
-            <w:tcW w:w="2835" w:type="dxa"/>
-            <w:tcBorders>
-              <w:top w:val="single" w:sz="4" w:space="0" w:color="AAAAAA"/>
-              <w:left w:val="single" w:sz="4" w:space="0" w:color="AAAAAA"/>
-              <w:bottom w:val="single" w:sz="4" w:space="0" w:color="AAAAAA"/>
-              <w:right w:val="single" w:sz="4" w:space="0" w:color="AAAAAA"/>
-            </w:tcBorders>
-            <w:shd w:val="clear" w:color="auto" w:fill="1F3864"/>
-            <w:tcMar>
-              <w:top w:w="80" w:type="dxa"/>
-              <w:left w:w="120" w:type="dxa"/>
-              <w:bottom w:w="80" w:type="dxa"/>
-              <w:right w:w="120" w:type="dxa"/>
-            </w:tcMar>
-            <w:vAlign w:val="center"/>
-          </w:tcPr>
-          <w:p>
-            <w:pPr>
-              <w:jc w:val="center"/>
-              <w:rPr>
-                <w:sz w:val="28"/>
-                <w:szCs w:val="28"/>
-              </w:rPr>
-            </w:pPr>
-            <w:r>
-              <w:rPr>
-                <w:b/>
-                <w:bCs/>
-                <w:color w:val="FFFFFF"/>
-                <w:sz w:val="28"/>
-                <w:szCs w:val="28"/>
-                <w:cs/>
-              </w:rPr>
-              <w:t>ผู้ถูกเรียกเก็บ</w:t>
-            </w:r>
-          </w:p>
-        </w:tc>
-        <w:tc>
-          <w:tcPr>
-            <w:tcW w:w="4536" w:type="dxa"/>
-            <w:tcBorders>
-              <w:top w:val="single" w:sz="4" w:space="0" w:color="AAAAAA"/>
-              <w:left w:val="single" w:sz="4" w:space="0" w:color="AAAAAA"/>
-              <w:bottom w:val="single" w:sz="4" w:space="0" w:color="AAAAAA"/>
-              <w:right w:val="single" w:sz="4" w:space="0" w:color="AAAAAA"/>
-            </w:tcBorders>
-            <w:shd w:val="clear" w:color="auto" w:fill="1F3864"/>
-            <w:tcMar>
-              <w:top w:w="80" w:type="dxa"/>
-              <w:left w:w="120" w:type="dxa"/>
-              <w:bottom w:w="80" w:type="dxa"/>
-              <w:right w:w="120" w:type="dxa"/>
-            </w:tcMar>
-            <w:vAlign w:val="center"/>
-          </w:tcPr>
-          <w:p>
-            <w:pPr>
-              <w:jc w:val="center"/>
-              <w:rPr>
-                <w:sz w:val="28"/>
-                <w:szCs w:val="28"/>
-              </w:rPr>
-            </w:pPr>
-            <w:r>
-              <w:rPr>
-                <w:rFonts w:hint="cs"/>
-                <w:b/>
-                <w:bCs/>
-                <w:color w:val="FFFFFF"/>
-                <w:sz w:val="28"/>
-                <w:szCs w:val="28"/>
-                <w:cs/>
-              </w:rPr>
-              <w:t>เงื่อนไข</w:t>
-            </w:r>
-          </w:p>
-        </w:tc>
-      </w:tr>
-      <w:tr>
-        <w:tc>
-          <w:tcPr>
-            <w:tcW w:w="1838" w:type="dxa"/>
-            <w:tcBorders>
-              <w:top w:val="single" w:sz="4" w:space="0" w:color="AAAAAA"/>
-              <w:left w:val="single" w:sz="4" w:space="0" w:color="AAAAAA"/>
-              <w:bottom w:val="single" w:sz="4" w:space="0" w:color="AAAAAA"/>
-              <w:right w:val="single" w:sz="4" w:space="0" w:color="AAAAAA"/>
-            </w:tcBorders>
-            <w:shd w:val="clear" w:color="auto" w:fill="FFFFFF"/>
-            <w:tcMar>
-              <w:top w:w="80" w:type="dxa"/>
-              <w:left w:w="80" w:type="dxa"/>
-              <w:bottom w:w="80" w:type="dxa"/>
-              <w:right w:w="80" w:type="dxa"/>
-            </w:tcMar>
-            <w:vAlign w:val="center"/>
-          </w:tcPr>
-          <w:p>
-            <w:pPr>
-              <w:jc w:val="thaiDistribute"/>
-              <w:rPr>
-                <w:sz w:val="28"/>
-                <w:szCs w:val="28"/>
-              </w:rPr>
-            </w:pPr>
-          </w:p>
-        </w:tc>
-        <w:tc>
-          <w:tcPr>
-            <w:tcW w:w="2835" w:type="dxa"/>
-            <w:tcBorders>
-              <w:top w:val="single" w:sz="4" w:space="0" w:color="AAAAAA"/>
-              <w:left w:val="single" w:sz="4" w:space="0" w:color="AAAAAA"/>
-              <w:bottom w:val="single" w:sz="4" w:space="0" w:color="AAAAAA"/>
-              <w:right w:val="single" w:sz="4" w:space="0" w:color="AAAAAA"/>
-            </w:tcBorders>
-            <w:shd w:val="clear" w:color="auto" w:fill="FFFFFF"/>
-            <w:tcMar>
-              <w:top w:w="80" w:type="dxa"/>
-              <w:left w:w="120" w:type="dxa"/>
-              <w:bottom w:w="80" w:type="dxa"/>
-              <w:right w:w="120" w:type="dxa"/>
-            </w:tcMar>
-            <w:vAlign w:val="center"/>
-          </w:tcPr>
-          <w:p>
-            <w:pPr>
-              <w:rPr>
-                <w:sz w:val="28"/>
-                <w:szCs w:val="28"/>
-              </w:rPr>
-            </w:pPr>
-          </w:p>
-        </w:tc>
-        <w:tc>
-          <w:tcPr>
-            <w:tcW w:w="4536" w:type="dxa"/>
-            <w:tcBorders>
-              <w:top w:val="single" w:sz="4" w:space="0" w:color="AAAAAA"/>
-              <w:left w:val="single" w:sz="4" w:space="0" w:color="AAAAAA"/>
-              <w:bottom w:val="single" w:sz="4" w:space="0" w:color="AAAAAA"/>
-              <w:right w:val="single" w:sz="4" w:space="0" w:color="AAAAAA"/>
-            </w:tcBorders>
-            <w:shd w:val="clear" w:color="auto" w:fill="FFFFFF"/>
-            <w:tcMar>
-              <w:top w:w="80" w:type="dxa"/>
-              <w:left w:w="120" w:type="dxa"/>
-              <w:bottom w:w="80" w:type="dxa"/>
-              <w:right w:w="120" w:type="dxa"/>
-            </w:tcMar>
-            <w:vAlign w:val="center"/>
-          </w:tcPr>
-          <w:p>
-            <w:pPr>
-              <w:jc w:val="thaiDistribute"/>
-              <w:rPr>
-                <w:sz w:val="28"/>
-                <w:szCs w:val="28"/>
-              </w:rPr>
-            </w:pPr>
-          </w:p>
-        </w:tc>
-      </w:tr>
-      <w:tr>
-        <w:tc>
-          <w:tcPr>
-            <w:tcW w:w="1838" w:type="dxa"/>
-            <w:tcBorders>
-              <w:top w:val="single" w:sz="4" w:space="0" w:color="AAAAAA"/>
-              <w:left w:val="single" w:sz="4" w:space="0" w:color="AAAAAA"/>
-              <w:bottom w:val="single" w:sz="4" w:space="0" w:color="AAAAAA"/>
-              <w:right w:val="single" w:sz="4" w:space="0" w:color="AAAAAA"/>
-            </w:tcBorders>
-            <w:shd w:val="clear" w:color="auto" w:fill="FFFFFF"/>
-            <w:tcMar>
-              <w:top w:w="80" w:type="dxa"/>
-              <w:left w:w="80" w:type="dxa"/>
-              <w:bottom w:w="80" w:type="dxa"/>
-              <w:right w:w="80" w:type="dxa"/>
-            </w:tcMar>
-            <w:vAlign w:val="center"/>
-          </w:tcPr>
-          <w:p>
-            <w:pPr>
-              <w:jc w:val="thaiDistribute"/>
-              <w:rPr>
-                <w:sz w:val="28"/>
-                <w:szCs w:val="28"/>
-              </w:rPr>
-            </w:pPr>
-          </w:p>
-        </w:tc>
-        <w:tc>
-          <w:tcPr>
-            <w:tcW w:w="2835" w:type="dxa"/>
-            <w:tcBorders>
-              <w:top w:val="single" w:sz="4" w:space="0" w:color="AAAAAA"/>
-              <w:left w:val="single" w:sz="4" w:space="0" w:color="AAAAAA"/>
-              <w:bottom w:val="single" w:sz="4" w:space="0" w:color="AAAAAA"/>
-              <w:right w:val="single" w:sz="4" w:space="0" w:color="AAAAAA"/>
-            </w:tcBorders>
-            <w:shd w:val="clear" w:color="auto" w:fill="FFFFFF"/>
-            <w:tcMar>
-              <w:top w:w="80" w:type="dxa"/>
-              <w:left w:w="120" w:type="dxa"/>
-              <w:bottom w:w="80" w:type="dxa"/>
-              <w:right w:w="120" w:type="dxa"/>
-            </w:tcMar>
-            <w:vAlign w:val="center"/>
-          </w:tcPr>
-          <w:p>
-            <w:pPr>
-              <w:rPr>
-                <w:sz w:val="28"/>
-                <w:szCs w:val="28"/>
-                <w:cs/>
-              </w:rPr>
-            </w:pPr>
-          </w:p>
-        </w:tc>
-        <w:tc>
-          <w:tcPr>
-            <w:tcW w:w="4536" w:type="dxa"/>
-            <w:tcBorders>
-              <w:top w:val="single" w:sz="4" w:space="0" w:color="AAAAAA"/>
-              <w:left w:val="single" w:sz="4" w:space="0" w:color="AAAAAA"/>
-              <w:bottom w:val="single" w:sz="4" w:space="0" w:color="AAAAAA"/>
-              <w:right w:val="single" w:sz="4" w:space="0" w:color="AAAAAA"/>
-            </w:tcBorders>
-            <w:shd w:val="clear" w:color="auto" w:fill="FFFFFF"/>
-            <w:tcMar>
-              <w:top w:w="80" w:type="dxa"/>
-              <w:left w:w="120" w:type="dxa"/>
-              <w:bottom w:w="80" w:type="dxa"/>
-              <w:right w:w="120" w:type="dxa"/>
-            </w:tcMar>
-            <w:vAlign w:val="center"/>
-          </w:tcPr>
-          <w:p>
-            <w:pPr>
-              <w:jc w:val="thaiDistribute"/>
-              <w:rPr>
-                <w:sz w:val="28"/>
-                <w:szCs w:val="28"/>
-                <w:cs/>
-              </w:rPr>
-            </w:pPr>
-          </w:p>
-        </w:tc>
-      </w:tr>
-      <w:tr>
-        <w:tc>
-          <w:tcPr>
-            <w:tcW w:w="1838" w:type="dxa"/>
-            <w:tcBorders>
-              <w:top w:val="single" w:sz="4" w:space="0" w:color="AAAAAA"/>
-              <w:left w:val="single" w:sz="4" w:space="0" w:color="AAAAAA"/>
-              <w:bottom w:val="single" w:sz="4" w:space="0" w:color="AAAAAA"/>
-              <w:right w:val="single" w:sz="4" w:space="0" w:color="AAAAAA"/>
-            </w:tcBorders>
-            <w:shd w:val="clear" w:color="auto" w:fill="FFFFFF"/>
-            <w:tcMar>
-              <w:top w:w="80" w:type="dxa"/>
-              <w:left w:w="80" w:type="dxa"/>
-              <w:bottom w:w="80" w:type="dxa"/>
-              <w:right w:w="80" w:type="dxa"/>
-            </w:tcMar>
-            <w:vAlign w:val="center"/>
-          </w:tcPr>
-          <w:p>
-            <w:pPr>
-              <w:rPr>
-                <w:sz w:val="28"/>
-                <w:szCs w:val="28"/>
-              </w:rPr>
-            </w:pPr>
-          </w:p>
-        </w:tc>
-        <w:tc>
-          <w:tcPr>
-            <w:tcW w:w="2835" w:type="dxa"/>
-            <w:tcBorders>
-              <w:top w:val="single" w:sz="4" w:space="0" w:color="AAAAAA"/>
-              <w:left w:val="single" w:sz="4" w:space="0" w:color="AAAAAA"/>
-              <w:bottom w:val="single" w:sz="4" w:space="0" w:color="AAAAAA"/>
-              <w:right w:val="single" w:sz="4" w:space="0" w:color="AAAAAA"/>
-            </w:tcBorders>
-            <w:shd w:val="clear" w:color="auto" w:fill="FFFFFF"/>
-            <w:tcMar>
-              <w:top w:w="80" w:type="dxa"/>
-              <w:left w:w="120" w:type="dxa"/>
-              <w:bottom w:w="80" w:type="dxa"/>
-              <w:right w:w="120" w:type="dxa"/>
-            </w:tcMar>
-            <w:vAlign w:val="center"/>
-          </w:tcPr>
-          <w:p>
-            <w:pPr>
-              <w:jc w:val="thaiDistribute"/>
-              <w:rPr>
-                <w:sz w:val="28"/>
-                <w:szCs w:val="28"/>
-                <w:cs/>
-              </w:rPr>
-            </w:pPr>
-          </w:p>
-        </w:tc>
-        <w:tc>
-          <w:tcPr>
-            <w:tcW w:w="4536" w:type="dxa"/>
-            <w:tcBorders>
-              <w:top w:val="single" w:sz="4" w:space="0" w:color="AAAAAA"/>
-              <w:left w:val="single" w:sz="4" w:space="0" w:color="AAAAAA"/>
-              <w:bottom w:val="single" w:sz="4" w:space="0" w:color="AAAAAA"/>
-              <w:right w:val="single" w:sz="4" w:space="0" w:color="AAAAAA"/>
-            </w:tcBorders>
-            <w:shd w:val="clear" w:color="auto" w:fill="FFFFFF"/>
-            <w:tcMar>
-              <w:top w:w="80" w:type="dxa"/>
-              <w:left w:w="120" w:type="dxa"/>
-              <w:bottom w:w="80" w:type="dxa"/>
-              <w:right w:w="120" w:type="dxa"/>
-            </w:tcMar>
-            <w:vAlign w:val="center"/>
-          </w:tcPr>
-          <w:p>
-            <w:pPr>
-              <w:jc w:val="thaiDistribute"/>
-              <w:rPr>
-                <w:sz w:val="28"/>
-                <w:szCs w:val="28"/>
-                <w:cs/>
-              </w:rPr>
-            </w:pPr>
-          </w:p>
-        </w:tc>
-      </w:tr>
-    </w:tbl>
-    <w:p>
-      <w:pPr>
-        <w:rPr>
-          <w:lang w:eastAsia="ja-JP"/>
-        </w:rPr>
-      </w:pPr>
+      <w:r>
+        <w:t>{@bodyPAYMENT_METHOD}</w:t>
+      </w:r>
     </w:p>
     <w:p>
       <w:pPr>
@@ -1729,143 +1314,17 @@
       </w:r>
     </w:p>
     <w:p>
-      <w:pPr>
-        <w:rPr>
-          <w:b/>
-          <w:bCs/>
-          <w:lang w:eastAsia="ja-JP"/>
-        </w:rPr>
-      </w:pPr>
-      <w:r>
-        <w:rPr>
-          <w:b/>
-          <w:bCs/>
+      <w:r>
+        <w:t>{@bodySOFTWARE_AGREEMENT}</w:t>
+      </w:r>
+    </w:p>
+    <w:p>
+      <w:pPr>
+        <w:pStyle w:val="Heading1"/>
+      </w:pPr>
+      <w:r>
+        <w:rPr>
           <w:cs/>
-          <w:lang w:eastAsia="ja-JP"/>
-        </w:rPr>
-        <w:t>15.1  ข้อกำหนดทางเทคนิค</w:t>
-      </w:r>
-    </w:p>
-    <w:p>
-      <w:pPr>
-        <w:rPr>
-          <w:b/>
-          <w:bCs/>
-          <w:lang w:eastAsia="ja-JP"/>
-        </w:rPr>
-      </w:pPr>
-    </w:p>
-    <w:p>
-      <w:pPr>
-        <w:rPr>
-          <w:b/>
-          <w:bCs/>
-          <w:lang w:eastAsia="ja-JP"/>
-        </w:rPr>
-      </w:pPr>
-      <w:r>
-        <w:rPr>
-          <w:b/>
-          <w:bCs/>
-          <w:cs/>
-          <w:lang w:eastAsia="ja-JP"/>
-        </w:rPr>
-        <w:t>15.2  ทรัพย์สินทางปัญญา (</w:t>
-      </w:r>
-      <w:r>
-        <w:rPr>
-          <w:b/>
-          <w:bCs/>
-          <w:lang w:eastAsia="ja-JP"/>
-        </w:rPr>
-        <w:t>Intellectual Property)</w:t>
-      </w:r>
-    </w:p>
-    <w:p>
-      <w:pPr>
-        <w:rPr>
-          <w:b/>
-          <w:bCs/>
-          <w:lang w:eastAsia="ja-JP"/>
-        </w:rPr>
-      </w:pPr>
-    </w:p>
-    <w:p>
-      <w:pPr>
-        <w:rPr>
-          <w:b/>
-          <w:bCs/>
-          <w:lang w:eastAsia="ja-JP"/>
-        </w:rPr>
-      </w:pPr>
-      <w:r>
-        <w:rPr>
-          <w:b/>
-          <w:bCs/>
-          <w:cs/>
-          <w:lang w:eastAsia="ja-JP"/>
-        </w:rPr>
-        <w:t>15.3  การส่งมอบ (</w:t>
-      </w:r>
-      <w:r>
-        <w:rPr>
-          <w:b/>
-          <w:bCs/>
-          <w:lang w:eastAsia="ja-JP"/>
-        </w:rPr>
-        <w:t>Deliverables)</w:t>
-      </w:r>
-    </w:p>
-    <w:p>
-      <w:pPr>
-        <w:rPr>
-          <w:b/>
-          <w:bCs/>
-          <w:lang w:eastAsia="ja-JP"/>
-        </w:rPr>
-      </w:pPr>
-    </w:p>
-    <w:p>
-      <w:pPr>
-        <w:rPr>
-          <w:b/>
-          <w:bCs/>
-          <w:lang w:eastAsia="ja-JP"/>
-        </w:rPr>
-      </w:pPr>
-      <w:r>
-        <w:rPr>
-          <w:b/>
-          <w:bCs/>
-          <w:cs/>
-          <w:lang w:eastAsia="ja-JP"/>
-        </w:rPr>
-        <w:t>15.4  การรับประกัน (</w:t>
-      </w:r>
-      <w:r>
-        <w:rPr>
-          <w:b/>
-          <w:bCs/>
-          <w:lang w:eastAsia="ja-JP"/>
-        </w:rPr>
-        <w:t>Warranty)</w:t>
-      </w:r>
-    </w:p>
-    <w:p>
-      <w:pPr>
-        <w:rPr>
-          <w:rFonts w:eastAsia="Sarabun"/>
-          <w:color w:val="000000" w:themeColor="text1"/>
-        </w:rPr>
-      </w:pPr>
-    </w:p>
-    <w:p>
-      <w:pPr>
-        <w:pStyle w:val="Heading1"/>
-      </w:pPr>
-      <w:r>
-        <w:rPr>
-          <w:cs/>
         </w:rPr>
         <w:t>ลายมือชื่อ (</w:t>
       </w:r>
@@ -1874,478 +1333,9 @@
       </w:r>
     </w:p>
     <w:p>
-      <w:pPr>
-        <w:pBdr>
-          <w:top w:val="nil"/>
-          <w:left w:val="nil"/>
-          <w:bottom w:val="nil"/>
-          <w:right w:val="nil"/>
-          <w:between w:val="nil"/>
-        </w:pBdr>
-        <w:ind w:firstLine="284"/>
-        <w:jc w:val="thaiDistribute"/>
-        <w:rPr>
-          <w:rFonts w:eastAsia="Sarabun"/>
-          <w:color w:val="000000" w:themeColor="text1"/>
-        </w:rPr>
-      </w:pPr>
-      <w:bookmarkStart w:id="2" w:name="_heading=h.1fob9te" w:colFirst="0" w:colLast="0"/>
-      <w:bookmarkEnd w:id="2"/>
-      <w:r>
-        <w:rPr>
-          <w:rFonts w:eastAsia="Sarabun"/>
-          <w:color w:val="000000" w:themeColor="text1"/>
-          <w:cs/>
-        </w:rPr>
-        <w:t>เมื่อมีการเซ็น</w:t>
-      </w:r>
-      <w:proofErr w:type="spellStart"/>
-      <w:r>
-        <w:rPr>
-          <w:rFonts w:eastAsia="Sarabun"/>
-          <w:color w:val="000000" w:themeColor="text1"/>
-          <w:cs/>
-        </w:rPr>
-        <w:t>ต์</w:t>
-      </w:r>
-      <w:proofErr w:type="spellEnd"/>
-      <w:r>
-        <w:rPr>
-          <w:rFonts w:eastAsia="Sarabun"/>
-          <w:color w:val="000000" w:themeColor="text1"/>
-          <w:cs/>
-        </w:rPr>
-        <w:t xml:space="preserve">ชื่อครบทุกฝ่ายแล้วถือเป็นการยืนยันการเริ่มต้นการพัฒนา จะไม่มีการแก้ไขหรือเพิ่มเติมในภายหลัง หากต้องการเพิ่มเติมหรือแก้ไขจะต้องทำเอกสาร </w:t>
-      </w:r>
-      <w:r>
-        <w:rPr>
-          <w:rFonts w:eastAsia="Sarabun"/>
-          <w:color w:val="000000" w:themeColor="text1"/>
-        </w:rPr>
-        <w:t xml:space="preserve">Change Request </w:t>
-      </w:r>
-      <w:r>
-        <w:rPr>
-          <w:rFonts w:eastAsia="Sarabun"/>
-          <w:color w:val="000000" w:themeColor="text1"/>
-          <w:cs/>
-        </w:rPr>
-        <w:t>ในครั้งต่อไป</w:t>
-      </w:r>
-    </w:p>
-    <w:tbl>
-      <w:tblPr>
-        <w:tblW w:w="9360" w:type="dxa"/>
-        <w:tblBorders>
-          <w:top w:val="single" w:sz="4" w:space="0" w:color="auto"/>
-          <w:left w:val="single" w:sz="4" w:space="0" w:color="auto"/>
-          <w:bottom w:val="single" w:sz="4" w:space="0" w:color="auto"/>
-          <w:right w:val="single" w:sz="4" w:space="0" w:color="auto"/>
-          <w:insideH w:val="single" w:sz="4" w:space="0" w:color="auto"/>
-          <w:insideV w:val="single" w:sz="4" w:space="0" w:color="auto"/>
-        </w:tblBorders>
-        <w:tblCellMar>
-          <w:left w:w="10" w:type="dxa"/>
-          <w:right w:w="10" w:type="dxa"/>
-        </w:tblCellMar>
-        <w:tblLook w:val="04A0" w:firstRow="1" w:lastRow="0" w:firstColumn="1" w:lastColumn="0" w:noHBand="0" w:noVBand="1"/>
-      </w:tblPr>
-      <w:tblGrid>
-        <w:gridCol w:w="2400"/>
-        <w:gridCol w:w="2760"/>
-        <w:gridCol w:w="2200"/>
-        <w:gridCol w:w="2000"/>
-      </w:tblGrid>
-      <w:tr>
-        <w:trPr>
-          <w:tblHeader/>
-        </w:trPr>
-        <w:tc>
-          <w:tcPr>
-            <w:tcW w:w="2400" w:type="dxa"/>
-            <w:tcBorders>
-              <w:top w:val="single" w:sz="4" w:space="0" w:color="AAAAAA"/>
-              <w:left w:val="single" w:sz="4" w:space="0" w:color="AAAAAA"/>
-              <w:bottom w:val="single" w:sz="4" w:space="0" w:color="AAAAAA"/>
-              <w:right w:val="single" w:sz="4" w:space="0" w:color="AAAAAA"/>
-            </w:tcBorders>
-            <w:shd w:val="clear" w:color="auto" w:fill="1F3864"/>
-            <w:tcMar>
-              <w:top w:w="80" w:type="dxa"/>
-              <w:left w:w="120" w:type="dxa"/>
-              <w:bottom w:w="80" w:type="dxa"/>
-              <w:right w:w="120" w:type="dxa"/>
-            </w:tcMar>
-            <w:vAlign w:val="center"/>
-          </w:tcPr>
-          <w:p>
-            <w:pPr>
-              <w:jc w:val="center"/>
-            </w:pPr>
-            <w:proofErr w:type="spellStart"/>
-            <w:r>
-              <w:rPr>
-                <w:b/>
-                <w:bCs/>
-                <w:color w:val="FFFFFF"/>
-              </w:rPr>
-              <w:t>ตำแหน่ง</w:t>
-            </w:r>
-            <w:proofErr w:type="spellEnd"/>
-          </w:p>
-        </w:tc>
-        <w:tc>
-          <w:tcPr>
-            <w:tcW w:w="2760" w:type="dxa"/>
-            <w:tcBorders>
-              <w:top w:val="single" w:sz="4" w:space="0" w:color="AAAAAA"/>
-              <w:left w:val="single" w:sz="4" w:space="0" w:color="AAAAAA"/>
-              <w:bottom w:val="single" w:sz="4" w:space="0" w:color="AAAAAA"/>
-              <w:right w:val="single" w:sz="4" w:space="0" w:color="AAAAAA"/>
-            </w:tcBorders>
-            <w:shd w:val="clear" w:color="auto" w:fill="1F3864"/>
-            <w:tcMar>
-              <w:top w:w="80" w:type="dxa"/>
-              <w:left w:w="120" w:type="dxa"/>
-              <w:bottom w:w="80" w:type="dxa"/>
-              <w:right w:w="120" w:type="dxa"/>
-            </w:tcMar>
-            <w:vAlign w:val="center"/>
-          </w:tcPr>
-          <w:p>
-            <w:pPr>
-              <w:jc w:val="center"/>
-            </w:pPr>
-            <w:proofErr w:type="spellStart"/>
-            <w:r>
-              <w:rPr>
-                <w:b/>
-                <w:bCs/>
-                <w:color w:val="FFFFFF"/>
-              </w:rPr>
-              <w:t>ชื่อ-นามสกุล</w:t>
-            </w:r>
-            <w:proofErr w:type="spellEnd"/>
-          </w:p>
-        </w:tc>
-        <w:tc>
-          <w:tcPr>
-            <w:tcW w:w="2200" w:type="dxa"/>
-            <w:tcBorders>
-              <w:top w:val="single" w:sz="4" w:space="0" w:color="AAAAAA"/>
-              <w:left w:val="single" w:sz="4" w:space="0" w:color="AAAAAA"/>
-              <w:bottom w:val="single" w:sz="4" w:space="0" w:color="AAAAAA"/>
-              <w:right w:val="single" w:sz="4" w:space="0" w:color="AAAAAA"/>
-            </w:tcBorders>
-            <w:shd w:val="clear" w:color="auto" w:fill="1F3864"/>
-            <w:tcMar>
-              <w:top w:w="80" w:type="dxa"/>
-              <w:left w:w="120" w:type="dxa"/>
-              <w:bottom w:w="80" w:type="dxa"/>
-              <w:right w:w="120" w:type="dxa"/>
-            </w:tcMar>
-            <w:vAlign w:val="center"/>
-          </w:tcPr>
-          <w:p>
-            <w:pPr>
-              <w:jc w:val="center"/>
-            </w:pPr>
-            <w:proofErr w:type="spellStart"/>
-            <w:r>
-              <w:rPr>
-                <w:b/>
-                <w:bCs/>
-                <w:color w:val="FFFFFF"/>
-              </w:rPr>
-              <w:t>ลายมือชื่อ</w:t>
-            </w:r>
-            <w:proofErr w:type="spellEnd"/>
-          </w:p>
-        </w:tc>
-        <w:tc>
-          <w:tcPr>
-            <w:tcW w:w="2000" w:type="dxa"/>
-            <w:tcBorders>
-              <w:top w:val="single" w:sz="4" w:space="0" w:color="AAAAAA"/>
-              <w:left w:val="single" w:sz="4" w:space="0" w:color="AAAAAA"/>
-              <w:bottom w:val="single" w:sz="4" w:space="0" w:color="AAAAAA"/>
-              <w:right w:val="single" w:sz="4" w:space="0" w:color="AAAAAA"/>
-            </w:tcBorders>
-            <w:shd w:val="clear" w:color="auto" w:fill="1F3864"/>
-            <w:tcMar>
-              <w:top w:w="80" w:type="dxa"/>
-              <w:left w:w="120" w:type="dxa"/>
-              <w:bottom w:w="80" w:type="dxa"/>
-              <w:right w:w="120" w:type="dxa"/>
-            </w:tcMar>
-            <w:vAlign w:val="center"/>
-          </w:tcPr>
-          <w:p>
-            <w:pPr>
-              <w:jc w:val="center"/>
-            </w:pPr>
-            <w:proofErr w:type="spellStart"/>
-            <w:r>
-              <w:rPr>
-                <w:b/>
-                <w:bCs/>
-                <w:color w:val="FFFFFF"/>
-              </w:rPr>
-              <w:t>วันที่</w:t>
-            </w:r>
-            <w:proofErr w:type="spellEnd"/>
-          </w:p>
-        </w:tc>
-      </w:tr>
-      <w:tr>
-        <w:tc>
-          <w:tcPr>
-            <w:tcW w:w="2400" w:type="dxa"/>
-            <w:tcBorders>
-              <w:top w:val="single" w:sz="4" w:space="0" w:color="AAAAAA"/>
-              <w:left w:val="single" w:sz="4" w:space="0" w:color="AAAAAA"/>
-              <w:bottom w:val="single" w:sz="4" w:space="0" w:color="AAAAAA"/>
-              <w:right w:val="single" w:sz="4" w:space="0" w:color="AAAAAA"/>
-            </w:tcBorders>
-            <w:shd w:val="clear" w:color="auto" w:fill="FFFFFF"/>
-            <w:tcMar>
-              <w:top w:w="80" w:type="dxa"/>
-              <w:left w:w="120" w:type="dxa"/>
-              <w:bottom w:w="80" w:type="dxa"/>
-              <w:right w:w="120" w:type="dxa"/>
-            </w:tcMar>
-            <w:vAlign w:val="center"/>
-          </w:tcPr>
-          <w:p/>
-        </w:tc>
-        <w:tc>
-          <w:tcPr>
-            <w:tcW w:w="2760" w:type="dxa"/>
-            <w:tcBorders>
-              <w:top w:val="single" w:sz="4" w:space="0" w:color="AAAAAA"/>
-              <w:left w:val="single" w:sz="4" w:space="0" w:color="AAAAAA"/>
-              <w:bottom w:val="single" w:sz="4" w:space="0" w:color="AAAAAA"/>
-              <w:right w:val="single" w:sz="4" w:space="0" w:color="AAAAAA"/>
-            </w:tcBorders>
-            <w:shd w:val="clear" w:color="auto" w:fill="FFFFFF"/>
-            <w:tcMar>
-              <w:top w:w="80" w:type="dxa"/>
-              <w:left w:w="120" w:type="dxa"/>
-              <w:bottom w:w="80" w:type="dxa"/>
-              <w:right w:w="120" w:type="dxa"/>
-            </w:tcMar>
-            <w:vAlign w:val="center"/>
-          </w:tcPr>
-          <w:p/>
-        </w:tc>
-        <w:tc>
-          <w:tcPr>
-            <w:tcW w:w="2200" w:type="dxa"/>
-            <w:tcBorders>
-              <w:top w:val="single" w:sz="4" w:space="0" w:color="AAAAAA"/>
-              <w:left w:val="single" w:sz="4" w:space="0" w:color="AAAAAA"/>
-              <w:bottom w:val="single" w:sz="4" w:space="0" w:color="AAAAAA"/>
-              <w:right w:val="single" w:sz="4" w:space="0" w:color="AAAAAA"/>
-            </w:tcBorders>
-            <w:shd w:val="clear" w:color="auto" w:fill="FFFFFF"/>
-            <w:tcMar>
-              <w:top w:w="240" w:type="dxa"/>
-              <w:left w:w="120" w:type="dxa"/>
-              <w:bottom w:w="240" w:type="dxa"/>
-              <w:right w:w="120" w:type="dxa"/>
-            </w:tcMar>
-          </w:tcPr>
-          <w:p/>
-        </w:tc>
-        <w:tc>
-          <w:tcPr>
-            <w:tcW w:w="2000" w:type="dxa"/>
-            <w:tcBorders>
-              <w:top w:val="single" w:sz="4" w:space="0" w:color="AAAAAA"/>
-              <w:left w:val="single" w:sz="4" w:space="0" w:color="AAAAAA"/>
-              <w:bottom w:val="single" w:sz="4" w:space="0" w:color="AAAAAA"/>
-              <w:right w:val="single" w:sz="4" w:space="0" w:color="AAAAAA"/>
-            </w:tcBorders>
-            <w:shd w:val="clear" w:color="auto" w:fill="FFFFFF"/>
-            <w:tcMar>
-              <w:top w:w="240" w:type="dxa"/>
-              <w:left w:w="120" w:type="dxa"/>
-              <w:bottom w:w="240" w:type="dxa"/>
-              <w:right w:w="120" w:type="dxa"/>
-            </w:tcMar>
-          </w:tcPr>
-          <w:p/>
-        </w:tc>
-      </w:tr>
-      <w:tr>
-        <w:tc>
-          <w:tcPr>
-            <w:tcW w:w="2400" w:type="dxa"/>
-            <w:tcBorders>
-              <w:top w:val="single" w:sz="4" w:space="0" w:color="AAAAAA"/>
-              <w:left w:val="single" w:sz="4" w:space="0" w:color="AAAAAA"/>
-              <w:bottom w:val="single" w:sz="4" w:space="0" w:color="AAAAAA"/>
-              <w:right w:val="single" w:sz="4" w:space="0" w:color="AAAAAA"/>
-            </w:tcBorders>
-            <w:shd w:val="clear" w:color="auto" w:fill="FFFFFF"/>
-            <w:tcMar>
-              <w:top w:w="80" w:type="dxa"/>
-              <w:left w:w="120" w:type="dxa"/>
-              <w:bottom w:w="80" w:type="dxa"/>
-              <w:right w:w="120" w:type="dxa"/>
-            </w:tcMar>
-            <w:vAlign w:val="center"/>
-          </w:tcPr>
-          <w:p/>
-        </w:tc>
-        <w:tc>
-          <w:tcPr>
-            <w:tcW w:w="2760" w:type="dxa"/>
-            <w:tcBorders>
-              <w:top w:val="single" w:sz="4" w:space="0" w:color="AAAAAA"/>
-              <w:left w:val="single" w:sz="4" w:space="0" w:color="AAAAAA"/>
-              <w:bottom w:val="single" w:sz="4" w:space="0" w:color="AAAAAA"/>
-              <w:right w:val="single" w:sz="4" w:space="0" w:color="AAAAAA"/>
-            </w:tcBorders>
-            <w:shd w:val="clear" w:color="auto" w:fill="FFFFFF"/>
-            <w:tcMar>
-              <w:top w:w="80" w:type="dxa"/>
-              <w:left w:w="120" w:type="dxa"/>
-              <w:bottom w:w="80" w:type="dxa"/>
-              <w:right w:w="120" w:type="dxa"/>
-            </w:tcMar>
-            <w:vAlign w:val="center"/>
-          </w:tcPr>
-          <w:p/>
-        </w:tc>
-        <w:tc>
-          <w:tcPr>
-            <w:tcW w:w="2200" w:type="dxa"/>
-            <w:tcBorders>
-              <w:top w:val="single" w:sz="4" w:space="0" w:color="AAAAAA"/>
-              <w:left w:val="single" w:sz="4" w:space="0" w:color="AAAAAA"/>
-              <w:bottom w:val="single" w:sz="4" w:space="0" w:color="AAAAAA"/>
-              <w:right w:val="single" w:sz="4" w:space="0" w:color="AAAAAA"/>
-            </w:tcBorders>
-            <w:shd w:val="clear" w:color="auto" w:fill="FFFFFF"/>
-            <w:tcMar>
-              <w:top w:w="240" w:type="dxa"/>
-              <w:left w:w="120" w:type="dxa"/>
-              <w:bottom w:w="240" w:type="dxa"/>
-              <w:right w:w="120" w:type="dxa"/>
-            </w:tcMar>
-          </w:tcPr>
-          <w:p/>
-        </w:tc>
-        <w:tc>
-          <w:tcPr>
-            <w:tcW w:w="2000" w:type="dxa"/>
-            <w:tcBorders>
-              <w:top w:val="single" w:sz="4" w:space="0" w:color="AAAAAA"/>
-              <w:left w:val="single" w:sz="4" w:space="0" w:color="AAAAAA"/>
-              <w:bottom w:val="single" w:sz="4" w:space="0" w:color="AAAAAA"/>
-              <w:right w:val="single" w:sz="4" w:space="0" w:color="AAAAAA"/>
-            </w:tcBorders>
-            <w:shd w:val="clear" w:color="auto" w:fill="FFFFFF"/>
-            <w:tcMar>
-              <w:top w:w="240" w:type="dxa"/>
-              <w:left w:w="120" w:type="dxa"/>
-              <w:bottom w:w="240" w:type="dxa"/>
-              <w:right w:w="120" w:type="dxa"/>
-            </w:tcMar>
-          </w:tcPr>
-          <w:p/>
-        </w:tc>
-      </w:tr>
-      <w:tr>
-        <w:tc>
-          <w:tcPr>
-            <w:tcW w:w="2400" w:type="dxa"/>
-            <w:tcBorders>
-              <w:top w:val="single" w:sz="4" w:space="0" w:color="AAAAAA"/>
-              <w:left w:val="single" w:sz="4" w:space="0" w:color="AAAAAA"/>
-              <w:bottom w:val="single" w:sz="4" w:space="0" w:color="AAAAAA"/>
-              <w:right w:val="single" w:sz="4" w:space="0" w:color="AAAAAA"/>
-            </w:tcBorders>
-            <w:shd w:val="clear" w:color="auto" w:fill="FFFFFF"/>
-            <w:tcMar>
-              <w:top w:w="80" w:type="dxa"/>
-              <w:left w:w="120" w:type="dxa"/>
-              <w:bottom w:w="80" w:type="dxa"/>
-              <w:right w:w="120" w:type="dxa"/>
-            </w:tcMar>
-            <w:vAlign w:val="center"/>
-          </w:tcPr>
-          <w:p/>
-        </w:tc>
-        <w:tc>
-          <w:tcPr>
-            <w:tcW w:w="2760" w:type="dxa"/>
-            <w:tcBorders>
-              <w:top w:val="single" w:sz="4" w:space="0" w:color="AAAAAA"/>
-              <w:left w:val="single" w:sz="4" w:space="0" w:color="AAAAAA"/>
-              <w:bottom w:val="single" w:sz="4" w:space="0" w:color="AAAAAA"/>
-              <w:right w:val="single" w:sz="4" w:space="0" w:color="AAAAAA"/>
-            </w:tcBorders>
-            <w:shd w:val="clear" w:color="auto" w:fill="FFFFFF"/>
-            <w:tcMar>
-              <w:top w:w="80" w:type="dxa"/>
-              <w:left w:w="120" w:type="dxa"/>
-              <w:bottom w:w="80" w:type="dxa"/>
-              <w:right w:w="120" w:type="dxa"/>
-            </w:tcMar>
-            <w:vAlign w:val="center"/>
-          </w:tcPr>
-          <w:p/>
-        </w:tc>
-        <w:tc>
-          <w:tcPr>
-            <w:tcW w:w="2200" w:type="dxa"/>
-            <w:tcBorders>
-              <w:top w:val="single" w:sz="4" w:space="0" w:color="AAAAAA"/>
-              <w:left w:val="single" w:sz="4" w:space="0" w:color="AAAAAA"/>
-              <w:bottom w:val="single" w:sz="4" w:space="0" w:color="AAAAAA"/>
-              <w:right w:val="single" w:sz="4" w:space="0" w:color="AAAAAA"/>
-            </w:tcBorders>
-            <w:shd w:val="clear" w:color="auto" w:fill="FFFFFF"/>
-            <w:tcMar>
-              <w:top w:w="240" w:type="dxa"/>
-              <w:left w:w="120" w:type="dxa"/>
-              <w:bottom w:w="240" w:type="dxa"/>
-              <w:right w:w="120" w:type="dxa"/>
-            </w:tcMar>
-          </w:tcPr>
-          <w:p/>
-        </w:tc>
-        <w:tc>
-          <w:tcPr>
-            <w:tcW w:w="2000" w:type="dxa"/>
-            <w:tcBorders>
-              <w:top w:val="single" w:sz="4" w:space="0" w:color="AAAAAA"/>
-              <w:left w:val="single" w:sz="4" w:space="0" w:color="AAAAAA"/>
-              <w:bottom w:val="single" w:sz="4" w:space="0" w:color="AAAAAA"/>
-              <w:right w:val="single" w:sz="4" w:space="0" w:color="AAAAAA"/>
-            </w:tcBorders>
-            <w:shd w:val="clear" w:color="auto" w:fill="FFFFFF"/>
-            <w:tcMar>
-              <w:top w:w="240" w:type="dxa"/>
-              <w:left w:w="120" w:type="dxa"/>
-              <w:bottom w:w="240" w:type="dxa"/>
-              <w:right w:w="120" w:type="dxa"/>
-            </w:tcMar>
-          </w:tcPr>
-          <w:p/>
-        </w:tc>
-      </w:tr>
-    </w:tbl>
-    <w:p>
-      <w:pPr>
-        <w:jc w:val="thaiDistribute"/>
-        <w:rPr>
-          <w:color w:val="000000" w:themeColor="text1"/>
-          <w:cs/>
-        </w:rPr>
-      </w:pPr>
+      <w:r>
+        <w:t>{@bodySIGNATURES}</w:t>
+      </w:r>
     </w:p>
     <w:sectPr>
       <w:headerReference w:type="default" r:id="rId13"/>

</xml_diff>